<commit_message>
fixed missing Part 13 for 16157-13
</commit_message>
<xml_diff>
--- a/input/CEN_TS_16157-13.docx
+++ b/input/CEN_TS_16157-13.docx
@@ -1,10 +1,10 @@
 
 <file path=word/document.xml><?xml version="1.0" encoding="utf-8"?>
-<w:document xmlns:wpc="http://schemas.microsoft.com/office/word/2010/wordprocessingCanvas" xmlns:cx="http://schemas.microsoft.com/office/drawing/2014/chartex" xmlns:cx1="http://schemas.microsoft.com/office/drawing/2015/9/8/chartex" xmlns:mc="http://schemas.openxmlformats.org/markup-compatibility/2006" xmlns:o="urn:schemas-microsoft-com:office:office" xmlns:r="http://schemas.openxmlformats.org/officeDocument/2006/relationships" xmlns:m="http://schemas.openxmlformats.org/officeDocument/2006/math" xmlns:v="urn:schemas-microsoft-com:vml" xmlns:wp14="http://schemas.microsoft.com/office/word/2010/wordprocessingDrawing" xmlns:wp="http://schemas.openxmlformats.org/drawingml/2006/wordprocessingDrawing" xmlns:w10="urn:schemas-microsoft-com:office:word" xmlns:w="http://schemas.openxmlformats.org/wordprocessingml/2006/main" xmlns:w14="http://schemas.microsoft.com/office/word/2010/wordml" xmlns:w15="http://schemas.microsoft.com/office/word/2012/wordml" xmlns:w16se="http://schemas.microsoft.com/office/word/2015/wordml/symex" xmlns:wpg="http://schemas.microsoft.com/office/word/2010/wordprocessingGroup" xmlns:wpi="http://schemas.microsoft.com/office/word/2010/wordprocessingInk" xmlns:wne="http://schemas.microsoft.com/office/word/2006/wordml" xmlns:wps="http://schemas.microsoft.com/office/word/2010/wordprocessingShape" mc:Ignorable="w14 w15 w16se wp14">
+<w:document xmlns:wpc="http://schemas.microsoft.com/office/word/2010/wordprocessingCanvas" xmlns:cx="http://schemas.microsoft.com/office/drawing/2014/chartex" xmlns:cx1="http://schemas.microsoft.com/office/drawing/2015/9/8/chartex" xmlns:cx2="http://schemas.microsoft.com/office/drawing/2015/10/21/chartex" xmlns:cx3="http://schemas.microsoft.com/office/drawing/2016/5/9/chartex" xmlns:cx4="http://schemas.microsoft.com/office/drawing/2016/5/10/chartex" xmlns:cx5="http://schemas.microsoft.com/office/drawing/2016/5/11/chartex" xmlns:cx6="http://schemas.microsoft.com/office/drawing/2016/5/12/chartex" xmlns:cx7="http://schemas.microsoft.com/office/drawing/2016/5/13/chartex" xmlns:cx8="http://schemas.microsoft.com/office/drawing/2016/5/14/chartex" xmlns:mc="http://schemas.openxmlformats.org/markup-compatibility/2006" xmlns:aink="http://schemas.microsoft.com/office/drawing/2016/ink" xmlns:am3d="http://schemas.microsoft.com/office/drawing/2017/model3d" xmlns:o="urn:schemas-microsoft-com:office:office" xmlns:oel="http://schemas.microsoft.com/office/2019/extlst" xmlns:r="http://schemas.openxmlformats.org/officeDocument/2006/relationships" xmlns:m="http://schemas.openxmlformats.org/officeDocument/2006/math" xmlns:v="urn:schemas-microsoft-com:vml" xmlns:wp14="http://schemas.microsoft.com/office/word/2010/wordprocessingDrawing" xmlns:wp="http://schemas.openxmlformats.org/drawingml/2006/wordprocessingDrawing" xmlns:w10="urn:schemas-microsoft-com:office:word" xmlns:w="http://schemas.openxmlformats.org/wordprocessingml/2006/main" xmlns:w14="http://schemas.microsoft.com/office/word/2010/wordml" xmlns:w15="http://schemas.microsoft.com/office/word/2012/wordml" xmlns:w16cex="http://schemas.microsoft.com/office/word/2018/wordml/cex" xmlns:w16cid="http://schemas.microsoft.com/office/word/2016/wordml/cid" xmlns:w16="http://schemas.microsoft.com/office/word/2018/wordml" xmlns:w16du="http://schemas.microsoft.com/office/word/2023/wordml/word16du" xmlns:w16sdtdh="http://schemas.microsoft.com/office/word/2020/wordml/sdtdatahash" xmlns:w16sdtfl="http://schemas.microsoft.com/office/word/2024/wordml/sdtformatlock" xmlns:w16se="http://schemas.microsoft.com/office/word/2015/wordml/symex" xmlns:wpg="http://schemas.microsoft.com/office/word/2010/wordprocessingGroup" xmlns:wpi="http://schemas.microsoft.com/office/word/2010/wordprocessingInk" xmlns:wne="http://schemas.microsoft.com/office/word/2006/wordml" xmlns:wps="http://schemas.microsoft.com/office/word/2010/wordprocessingShape" mc:Ignorable="w14 w15 w16se w16cid w16 w16cex w16sdtdh w16sdtfl w16du wp14">
   <w:body>
     <w:p>
       <w:pPr>
-        <w:pStyle w:val="Nzev"/>
+        <w:pStyle w:val="Title"/>
         <w:keepNext w:val="0"/>
         <w:keepLines w:val="0"/>
         <w:spacing w:before="0" w:after="60"/>
@@ -176,6 +176,25 @@
                 <w:lang w:val="en-GB"/>
               </w:rPr>
               <w:br/>
+            </w:r>
+            <w:r>
+              <w:rPr>
+                <w:b/>
+                <w:color w:val="000000"/>
+                <w:sz w:val="28"/>
+                <w:szCs w:val="28"/>
+                <w:lang w:val="en-GB"/>
+              </w:rPr>
+              <w:t xml:space="preserve">Part 13: </w:t>
+            </w:r>
+            <w:r>
+              <w:rPr>
+                <w:b/>
+                <w:color w:val="000000"/>
+                <w:sz w:val="28"/>
+                <w:szCs w:val="28"/>
+                <w:lang w:val="en-GB"/>
+              </w:rPr>
               <w:t>Status, fault and quality requirements</w:t>
             </w:r>
           </w:p>
@@ -284,7 +303,7 @@
     </w:p>
     <w:p>
       <w:pPr>
-        <w:pStyle w:val="Nadpis1"/>
+        <w:pStyle w:val="Heading1"/>
       </w:pPr>
       <w:r>
         <w:t>Introduction</w:t>
@@ -417,7 +436,7 @@
     </w:p>
     <w:p>
       <w:pPr>
-        <w:pStyle w:val="Nadpis1"/>
+        <w:pStyle w:val="Heading1"/>
         <w:jc w:val="both"/>
       </w:pPr>
       <w:r>
@@ -490,7 +509,7 @@
     </w:p>
     <w:p>
       <w:pPr>
-        <w:pStyle w:val="Nadpis1"/>
+        <w:pStyle w:val="Heading1"/>
         <w:jc w:val="both"/>
       </w:pPr>
       <w:r>
@@ -550,21 +569,7 @@
         <w:rPr>
           <w:lang w:val="en-GB"/>
         </w:rPr>
-        <w:t xml:space="preserve">— </w:t>
-      </w:r>
-      <w:proofErr w:type="gramStart"/>
-      <w:r>
-        <w:rPr>
-          <w:lang w:val="en-GB"/>
-        </w:rPr>
-        <w:t>their</w:t>
-      </w:r>
-      <w:proofErr w:type="gramEnd"/>
-      <w:r>
-        <w:rPr>
-          <w:lang w:val="en-GB"/>
-        </w:rPr>
-        <w:t xml:space="preserve"> inventory (description of the devices themselves including their location);</w:t>
+        <w:t>— their inventory (description of the devices themselves including their location);</w:t>
       </w:r>
     </w:p>
     <w:p>
@@ -578,21 +583,7 @@
         <w:rPr>
           <w:lang w:val="en-GB"/>
         </w:rPr>
-        <w:t xml:space="preserve">— </w:t>
-      </w:r>
-      <w:proofErr w:type="gramStart"/>
-      <w:r>
-        <w:rPr>
-          <w:lang w:val="en-GB"/>
-        </w:rPr>
-        <w:t>the</w:t>
-      </w:r>
-      <w:proofErr w:type="gramEnd"/>
-      <w:r>
-        <w:rPr>
-          <w:lang w:val="en-GB"/>
-        </w:rPr>
-        <w:t xml:space="preserve"> current operational status and ability to provide services;</w:t>
+        <w:t>— the current operational status and ability to provide services;</w:t>
       </w:r>
     </w:p>
     <w:p>
@@ -606,21 +597,7 @@
         <w:rPr>
           <w:lang w:val="en-GB"/>
         </w:rPr>
-        <w:t xml:space="preserve">— </w:t>
-      </w:r>
-      <w:proofErr w:type="gramStart"/>
-      <w:r>
-        <w:rPr>
-          <w:lang w:val="en-GB"/>
-        </w:rPr>
-        <w:t>information</w:t>
-      </w:r>
-      <w:proofErr w:type="gramEnd"/>
-      <w:r>
-        <w:rPr>
-          <w:lang w:val="en-GB"/>
-        </w:rPr>
-        <w:t xml:space="preserve"> on faults and defects affecting device functionality.</w:t>
+        <w:t>— information on faults and defects affecting device functionality.</w:t>
       </w:r>
     </w:p>
     <w:p>
@@ -640,7 +617,7 @@
     </w:p>
     <w:p>
       <w:pPr>
-        <w:pStyle w:val="Nadpis1"/>
+        <w:pStyle w:val="Heading1"/>
         <w:jc w:val="both"/>
       </w:pPr>
       <w:r>
@@ -670,21 +647,7 @@
         <w:rPr>
           <w:lang w:val="en-GB"/>
         </w:rPr>
-        <w:t xml:space="preserve"> presents a selection of the most important related documents, from both the </w:t>
-      </w:r>
-      <w:proofErr w:type="gramStart"/>
-      <w:r>
-        <w:rPr>
-          <w:lang w:val="en-GB"/>
-        </w:rPr>
-        <w:t>Normative</w:t>
-      </w:r>
-      <w:proofErr w:type="gramEnd"/>
-      <w:r>
-        <w:rPr>
-          <w:lang w:val="en-GB"/>
-        </w:rPr>
-        <w:t xml:space="preserve"> references and the Bibliography of the described document.</w:t>
+        <w:t xml:space="preserve"> presents a selection of the most important related documents, from both the Normative references and the Bibliography of the described document.</w:t>
       </w:r>
     </w:p>
     <w:p>
@@ -846,7 +809,7 @@
     </w:p>
     <w:p>
       <w:pPr>
-        <w:pStyle w:val="Nadpis1"/>
+        <w:pStyle w:val="Heading1"/>
         <w:numPr>
           <w:ilvl w:val="0"/>
           <w:numId w:val="1"/>
@@ -877,7 +840,6 @@
           <w:lang w:val="en-GB"/>
         </w:rPr>
       </w:pPr>
-      <w:proofErr w:type="gramStart"/>
       <w:r>
         <w:rPr>
           <w:b/>
@@ -885,7 +847,6 @@
         </w:rPr>
         <w:t>device</w:t>
       </w:r>
-      <w:proofErr w:type="gramEnd"/>
       <w:r>
         <w:rPr>
           <w:lang w:val="en-GB"/>
@@ -961,7 +922,6 @@
           <w:lang w:val="en-GB"/>
         </w:rPr>
       </w:pPr>
-      <w:proofErr w:type="gramStart"/>
       <w:r>
         <w:rPr>
           <w:b/>
@@ -969,7 +929,6 @@
         </w:rPr>
         <w:t>fault</w:t>
       </w:r>
-      <w:proofErr w:type="gramEnd"/>
       <w:r>
         <w:rPr>
           <w:lang w:val="en-GB"/>
@@ -979,7 +938,7 @@
     </w:p>
     <w:p>
       <w:pPr>
-        <w:pStyle w:val="Nadpis1"/>
+        <w:pStyle w:val="Heading1"/>
         <w:numPr>
           <w:ilvl w:val="0"/>
           <w:numId w:val="1"/>
@@ -1086,21 +1045,7 @@
         <w:rPr>
           <w:lang w:val="en-GB"/>
         </w:rPr>
-        <w:t xml:space="preserve"> </w:t>
-      </w:r>
-      <w:proofErr w:type="spellStart"/>
-      <w:r>
-        <w:rPr>
-          <w:lang w:val="en-GB"/>
-        </w:rPr>
-        <w:t>Markup</w:t>
-      </w:r>
-      <w:proofErr w:type="spellEnd"/>
-      <w:r>
-        <w:rPr>
-          <w:lang w:val="en-GB"/>
-        </w:rPr>
-        <w:t xml:space="preserve"> Language</w:t>
+        <w:t xml:space="preserve"> Markup Language</w:t>
       </w:r>
     </w:p>
     <w:p>
@@ -1147,27 +1092,7 @@
           <w:color w:val="000000"/>
           <w:lang w:val="en-GB"/>
         </w:rPr>
-        <w:t xml:space="preserve">NOTE: Other terms and abbreviations from the ITS domain can be found in the </w:t>
-      </w:r>
-      <w:proofErr w:type="spellStart"/>
-      <w:r>
-        <w:rPr>
-          <w:i/>
-          <w:iCs/>
-          <w:color w:val="000000"/>
-          <w:lang w:val="en-GB"/>
-        </w:rPr>
-        <w:t>ITSTerminology</w:t>
-      </w:r>
-      <w:proofErr w:type="spellEnd"/>
-      <w:r>
-        <w:rPr>
-          <w:i/>
-          <w:iCs/>
-          <w:color w:val="000000"/>
-          <w:lang w:val="en-GB"/>
-        </w:rPr>
-        <w:t xml:space="preserve"> dictionary (</w:t>
+        <w:t>NOTE: Other terms and abbreviations from the ITS domain can be found in the ITSTerminology dictionary (</w:t>
       </w:r>
       <w:hyperlink r:id="rId8">
         <w:r>
@@ -1242,7 +1167,7 @@
     </w:p>
     <w:p>
       <w:pPr>
-        <w:pStyle w:val="Nadpis1"/>
+        <w:pStyle w:val="Heading1"/>
         <w:jc w:val="both"/>
       </w:pPr>
       <w:r>
@@ -1301,7 +1226,7 @@
     </w:p>
     <w:p>
       <w:pPr>
-        <w:pStyle w:val="Nadpis2"/>
+        <w:pStyle w:val="Heading2"/>
         <w:jc w:val="both"/>
       </w:pPr>
       <w:r>
@@ -1708,7 +1633,7 @@
     </w:p>
     <w:p>
       <w:pPr>
-        <w:pStyle w:val="Nadpis2"/>
+        <w:pStyle w:val="Heading2"/>
         <w:jc w:val="both"/>
       </w:pPr>
       <w:r>
@@ -2071,7 +1996,7 @@
     </w:p>
     <w:p>
       <w:pPr>
-        <w:pStyle w:val="Nadpis2"/>
+        <w:pStyle w:val="Heading2"/>
         <w:jc w:val="both"/>
       </w:pPr>
       <w:r>
@@ -2327,7 +2252,7 @@
     </w:p>
     <w:p>
       <w:pPr>
-        <w:pStyle w:val="Nadpis2"/>
+        <w:pStyle w:val="Heading2"/>
         <w:jc w:val="both"/>
       </w:pPr>
       <w:r>
@@ -2560,7 +2485,7 @@
     </w:p>
     <w:p>
       <w:pPr>
-        <w:pStyle w:val="Nadpis2"/>
+        <w:pStyle w:val="Heading2"/>
         <w:jc w:val="both"/>
       </w:pPr>
       <w:r>
@@ -2767,7 +2692,7 @@
     </w:p>
     <w:p>
       <w:pPr>
-        <w:pStyle w:val="Nadpis2"/>
+        <w:pStyle w:val="Heading2"/>
         <w:jc w:val="both"/>
       </w:pPr>
       <w:r>
@@ -2823,19 +2748,11 @@
     </w:p>
     <w:p>
       <w:pPr>
-        <w:pStyle w:val="Nadpis1"/>
+        <w:pStyle w:val="Heading1"/>
         <w:jc w:val="both"/>
       </w:pPr>
       <w:r>
-        <w:t xml:space="preserve">Annex </w:t>
-      </w:r>
-      <w:proofErr w:type="gramStart"/>
-      <w:r>
-        <w:t>A</w:t>
-      </w:r>
-      <w:proofErr w:type="gramEnd"/>
-      <w:r>
-        <w:t xml:space="preserve"> (normative) Data Dictionary</w:t>
+        <w:t>Annex A (normative) Data Dictionary</w:t>
       </w:r>
     </w:p>
     <w:p>
@@ -5558,8 +5475,6 @@
                 <w:lang w:val="en-GB"/>
               </w:rPr>
             </w:pPr>
-            <w:bookmarkStart w:id="5" w:name="_GoBack"/>
-            <w:bookmarkEnd w:id="5"/>
             <w:r>
               <w:rPr>
                 <w:b/>
@@ -6171,7 +6086,7 @@
     </w:tbl>
     <w:p>
       <w:pPr>
-        <w:pStyle w:val="Nadpis1"/>
+        <w:pStyle w:val="Heading1"/>
         <w:jc w:val="both"/>
       </w:pPr>
       <w:r>
@@ -6208,7 +6123,7 @@
     </w:p>
     <w:p>
       <w:pPr>
-        <w:pStyle w:val="Nadpis1"/>
+        <w:pStyle w:val="Heading1"/>
         <w:jc w:val="both"/>
       </w:pPr>
       <w:r>
@@ -6284,7 +6199,7 @@
 </file>
 
 <file path=word/endnotes.xml><?xml version="1.0" encoding="utf-8"?>
-<w:endnotes xmlns:wpc="http://schemas.microsoft.com/office/word/2010/wordprocessingCanvas" xmlns:cx="http://schemas.microsoft.com/office/drawing/2014/chartex" xmlns:cx1="http://schemas.microsoft.com/office/drawing/2015/9/8/chartex" xmlns:mc="http://schemas.openxmlformats.org/markup-compatibility/2006" xmlns:o="urn:schemas-microsoft-com:office:office" xmlns:r="http://schemas.openxmlformats.org/officeDocument/2006/relationships" xmlns:m="http://schemas.openxmlformats.org/officeDocument/2006/math" xmlns:v="urn:schemas-microsoft-com:vml" xmlns:wp14="http://schemas.microsoft.com/office/word/2010/wordprocessingDrawing" xmlns:wp="http://schemas.openxmlformats.org/drawingml/2006/wordprocessingDrawing" xmlns:w10="urn:schemas-microsoft-com:office:word" xmlns:w="http://schemas.openxmlformats.org/wordprocessingml/2006/main" xmlns:w14="http://schemas.microsoft.com/office/word/2010/wordml" xmlns:w15="http://schemas.microsoft.com/office/word/2012/wordml" xmlns:w16se="http://schemas.microsoft.com/office/word/2015/wordml/symex" xmlns:wpg="http://schemas.microsoft.com/office/word/2010/wordprocessingGroup" xmlns:wpi="http://schemas.microsoft.com/office/word/2010/wordprocessingInk" xmlns:wne="http://schemas.microsoft.com/office/word/2006/wordml" xmlns:wps="http://schemas.microsoft.com/office/word/2010/wordprocessingShape" mc:Ignorable="w14 w15 w16se wp14">
+<w:endnotes xmlns:wpc="http://schemas.microsoft.com/office/word/2010/wordprocessingCanvas" xmlns:cx="http://schemas.microsoft.com/office/drawing/2014/chartex" xmlns:cx1="http://schemas.microsoft.com/office/drawing/2015/9/8/chartex" xmlns:cx2="http://schemas.microsoft.com/office/drawing/2015/10/21/chartex" xmlns:cx3="http://schemas.microsoft.com/office/drawing/2016/5/9/chartex" xmlns:cx4="http://schemas.microsoft.com/office/drawing/2016/5/10/chartex" xmlns:cx5="http://schemas.microsoft.com/office/drawing/2016/5/11/chartex" xmlns:cx6="http://schemas.microsoft.com/office/drawing/2016/5/12/chartex" xmlns:cx7="http://schemas.microsoft.com/office/drawing/2016/5/13/chartex" xmlns:cx8="http://schemas.microsoft.com/office/drawing/2016/5/14/chartex" xmlns:mc="http://schemas.openxmlformats.org/markup-compatibility/2006" xmlns:aink="http://schemas.microsoft.com/office/drawing/2016/ink" xmlns:am3d="http://schemas.microsoft.com/office/drawing/2017/model3d" xmlns:o="urn:schemas-microsoft-com:office:office" xmlns:oel="http://schemas.microsoft.com/office/2019/extlst" xmlns:r="http://schemas.openxmlformats.org/officeDocument/2006/relationships" xmlns:m="http://schemas.openxmlformats.org/officeDocument/2006/math" xmlns:v="urn:schemas-microsoft-com:vml" xmlns:wp14="http://schemas.microsoft.com/office/word/2010/wordprocessingDrawing" xmlns:wp="http://schemas.openxmlformats.org/drawingml/2006/wordprocessingDrawing" xmlns:w10="urn:schemas-microsoft-com:office:word" xmlns:w="http://schemas.openxmlformats.org/wordprocessingml/2006/main" xmlns:w14="http://schemas.microsoft.com/office/word/2010/wordml" xmlns:w15="http://schemas.microsoft.com/office/word/2012/wordml" xmlns:w16cex="http://schemas.microsoft.com/office/word/2018/wordml/cex" xmlns:w16cid="http://schemas.microsoft.com/office/word/2016/wordml/cid" xmlns:w16="http://schemas.microsoft.com/office/word/2018/wordml" xmlns:w16du="http://schemas.microsoft.com/office/word/2023/wordml/word16du" xmlns:w16sdtdh="http://schemas.microsoft.com/office/word/2020/wordml/sdtdatahash" xmlns:w16sdtfl="http://schemas.microsoft.com/office/word/2024/wordml/sdtformatlock" xmlns:w16se="http://schemas.microsoft.com/office/word/2015/wordml/symex" xmlns:wpg="http://schemas.microsoft.com/office/word/2010/wordprocessingGroup" xmlns:wpi="http://schemas.microsoft.com/office/word/2010/wordprocessingInk" xmlns:wne="http://schemas.microsoft.com/office/word/2006/wordml" xmlns:wps="http://schemas.microsoft.com/office/word/2010/wordprocessingShape" mc:Ignorable="w14 w15 w16se w16cid w16 w16cex w16sdtdh w16sdtfl w16du wp14">
   <w:endnote w:type="separator" w:id="-1">
     <w:p>
       <w:r>
@@ -6303,7 +6218,7 @@
 </file>
 
 <file path=word/footer1.xml><?xml version="1.0" encoding="utf-8"?>
-<w:ftr xmlns:wpc="http://schemas.microsoft.com/office/word/2010/wordprocessingCanvas" xmlns:cx="http://schemas.microsoft.com/office/drawing/2014/chartex" xmlns:cx1="http://schemas.microsoft.com/office/drawing/2015/9/8/chartex" xmlns:mc="http://schemas.openxmlformats.org/markup-compatibility/2006" xmlns:o="urn:schemas-microsoft-com:office:office" xmlns:r="http://schemas.openxmlformats.org/officeDocument/2006/relationships" xmlns:m="http://schemas.openxmlformats.org/officeDocument/2006/math" xmlns:v="urn:schemas-microsoft-com:vml" xmlns:wp14="http://schemas.microsoft.com/office/word/2010/wordprocessingDrawing" xmlns:wp="http://schemas.openxmlformats.org/drawingml/2006/wordprocessingDrawing" xmlns:w10="urn:schemas-microsoft-com:office:word" xmlns:w="http://schemas.openxmlformats.org/wordprocessingml/2006/main" xmlns:w14="http://schemas.microsoft.com/office/word/2010/wordml" xmlns:w15="http://schemas.microsoft.com/office/word/2012/wordml" xmlns:w16se="http://schemas.microsoft.com/office/word/2015/wordml/symex" xmlns:wpg="http://schemas.microsoft.com/office/word/2010/wordprocessingGroup" xmlns:wpi="http://schemas.microsoft.com/office/word/2010/wordprocessingInk" xmlns:wne="http://schemas.microsoft.com/office/word/2006/wordml" xmlns:wps="http://schemas.microsoft.com/office/word/2010/wordprocessingShape" mc:Ignorable="w14 w15 w16se wp14">
+<w:ftr xmlns:wpc="http://schemas.microsoft.com/office/word/2010/wordprocessingCanvas" xmlns:cx="http://schemas.microsoft.com/office/drawing/2014/chartex" xmlns:cx1="http://schemas.microsoft.com/office/drawing/2015/9/8/chartex" xmlns:cx2="http://schemas.microsoft.com/office/drawing/2015/10/21/chartex" xmlns:cx3="http://schemas.microsoft.com/office/drawing/2016/5/9/chartex" xmlns:cx4="http://schemas.microsoft.com/office/drawing/2016/5/10/chartex" xmlns:cx5="http://schemas.microsoft.com/office/drawing/2016/5/11/chartex" xmlns:cx6="http://schemas.microsoft.com/office/drawing/2016/5/12/chartex" xmlns:cx7="http://schemas.microsoft.com/office/drawing/2016/5/13/chartex" xmlns:cx8="http://schemas.microsoft.com/office/drawing/2016/5/14/chartex" xmlns:mc="http://schemas.openxmlformats.org/markup-compatibility/2006" xmlns:aink="http://schemas.microsoft.com/office/drawing/2016/ink" xmlns:am3d="http://schemas.microsoft.com/office/drawing/2017/model3d" xmlns:o="urn:schemas-microsoft-com:office:office" xmlns:oel="http://schemas.microsoft.com/office/2019/extlst" xmlns:r="http://schemas.openxmlformats.org/officeDocument/2006/relationships" xmlns:m="http://schemas.openxmlformats.org/officeDocument/2006/math" xmlns:v="urn:schemas-microsoft-com:vml" xmlns:wp14="http://schemas.microsoft.com/office/word/2010/wordprocessingDrawing" xmlns:wp="http://schemas.openxmlformats.org/drawingml/2006/wordprocessingDrawing" xmlns:w10="urn:schemas-microsoft-com:office:word" xmlns:w="http://schemas.openxmlformats.org/wordprocessingml/2006/main" xmlns:w14="http://schemas.microsoft.com/office/word/2010/wordml" xmlns:w15="http://schemas.microsoft.com/office/word/2012/wordml" xmlns:w16cex="http://schemas.microsoft.com/office/word/2018/wordml/cex" xmlns:w16cid="http://schemas.microsoft.com/office/word/2016/wordml/cid" xmlns:w16="http://schemas.microsoft.com/office/word/2018/wordml" xmlns:w16du="http://schemas.microsoft.com/office/word/2023/wordml/word16du" xmlns:w16sdtdh="http://schemas.microsoft.com/office/word/2020/wordml/sdtdatahash" xmlns:w16sdtfl="http://schemas.microsoft.com/office/word/2024/wordml/sdtformatlock" xmlns:w16se="http://schemas.microsoft.com/office/word/2015/wordml/symex" xmlns:wpg="http://schemas.microsoft.com/office/word/2010/wordprocessingGroup" xmlns:wpi="http://schemas.microsoft.com/office/word/2010/wordprocessingInk" xmlns:wne="http://schemas.microsoft.com/office/word/2006/wordml" xmlns:wps="http://schemas.microsoft.com/office/word/2010/wordprocessingShape" mc:Ignorable="w14 w15 w16se w16cid w16 w16cex w16sdtdh w16sdtfl w16du wp14">
   <w:p>
     <w:pPr>
       <w:spacing w:after="120"/>
@@ -6355,7 +6270,7 @@
 </file>
 
 <file path=word/footer2.xml><?xml version="1.0" encoding="utf-8"?>
-<w:ftr xmlns:wpc="http://schemas.microsoft.com/office/word/2010/wordprocessingCanvas" xmlns:cx="http://schemas.microsoft.com/office/drawing/2014/chartex" xmlns:cx1="http://schemas.microsoft.com/office/drawing/2015/9/8/chartex" xmlns:mc="http://schemas.openxmlformats.org/markup-compatibility/2006" xmlns:o="urn:schemas-microsoft-com:office:office" xmlns:r="http://schemas.openxmlformats.org/officeDocument/2006/relationships" xmlns:m="http://schemas.openxmlformats.org/officeDocument/2006/math" xmlns:v="urn:schemas-microsoft-com:vml" xmlns:wp14="http://schemas.microsoft.com/office/word/2010/wordprocessingDrawing" xmlns:wp="http://schemas.openxmlformats.org/drawingml/2006/wordprocessingDrawing" xmlns:w10="urn:schemas-microsoft-com:office:word" xmlns:w="http://schemas.openxmlformats.org/wordprocessingml/2006/main" xmlns:w14="http://schemas.microsoft.com/office/word/2010/wordml" xmlns:w15="http://schemas.microsoft.com/office/word/2012/wordml" xmlns:w16se="http://schemas.microsoft.com/office/word/2015/wordml/symex" xmlns:wpg="http://schemas.microsoft.com/office/word/2010/wordprocessingGroup" xmlns:wpi="http://schemas.microsoft.com/office/word/2010/wordprocessingInk" xmlns:wne="http://schemas.microsoft.com/office/word/2006/wordml" xmlns:wps="http://schemas.microsoft.com/office/word/2010/wordprocessingShape" mc:Ignorable="w14 w15 w16se wp14">
+<w:ftr xmlns:wpc="http://schemas.microsoft.com/office/word/2010/wordprocessingCanvas" xmlns:cx="http://schemas.microsoft.com/office/drawing/2014/chartex" xmlns:cx1="http://schemas.microsoft.com/office/drawing/2015/9/8/chartex" xmlns:cx2="http://schemas.microsoft.com/office/drawing/2015/10/21/chartex" xmlns:cx3="http://schemas.microsoft.com/office/drawing/2016/5/9/chartex" xmlns:cx4="http://schemas.microsoft.com/office/drawing/2016/5/10/chartex" xmlns:cx5="http://schemas.microsoft.com/office/drawing/2016/5/11/chartex" xmlns:cx6="http://schemas.microsoft.com/office/drawing/2016/5/12/chartex" xmlns:cx7="http://schemas.microsoft.com/office/drawing/2016/5/13/chartex" xmlns:cx8="http://schemas.microsoft.com/office/drawing/2016/5/14/chartex" xmlns:mc="http://schemas.openxmlformats.org/markup-compatibility/2006" xmlns:aink="http://schemas.microsoft.com/office/drawing/2016/ink" xmlns:am3d="http://schemas.microsoft.com/office/drawing/2017/model3d" xmlns:o="urn:schemas-microsoft-com:office:office" xmlns:oel="http://schemas.microsoft.com/office/2019/extlst" xmlns:r="http://schemas.openxmlformats.org/officeDocument/2006/relationships" xmlns:m="http://schemas.openxmlformats.org/officeDocument/2006/math" xmlns:v="urn:schemas-microsoft-com:vml" xmlns:wp14="http://schemas.microsoft.com/office/word/2010/wordprocessingDrawing" xmlns:wp="http://schemas.openxmlformats.org/drawingml/2006/wordprocessingDrawing" xmlns:w10="urn:schemas-microsoft-com:office:word" xmlns:w="http://schemas.openxmlformats.org/wordprocessingml/2006/main" xmlns:w14="http://schemas.microsoft.com/office/word/2010/wordml" xmlns:w15="http://schemas.microsoft.com/office/word/2012/wordml" xmlns:w16cex="http://schemas.microsoft.com/office/word/2018/wordml/cex" xmlns:w16cid="http://schemas.microsoft.com/office/word/2016/wordml/cid" xmlns:w16="http://schemas.microsoft.com/office/word/2018/wordml" xmlns:w16du="http://schemas.microsoft.com/office/word/2023/wordml/word16du" xmlns:w16sdtdh="http://schemas.microsoft.com/office/word/2020/wordml/sdtdatahash" xmlns:w16sdtfl="http://schemas.microsoft.com/office/word/2024/wordml/sdtformatlock" xmlns:w16se="http://schemas.microsoft.com/office/word/2015/wordml/symex" xmlns:wpg="http://schemas.microsoft.com/office/word/2010/wordprocessingGroup" xmlns:wpi="http://schemas.microsoft.com/office/word/2010/wordprocessingInk" xmlns:wne="http://schemas.microsoft.com/office/word/2006/wordml" xmlns:wps="http://schemas.microsoft.com/office/word/2010/wordprocessingShape" mc:Ignorable="w14 w15 w16se w16cid w16 w16cex w16sdtdh w16sdtfl w16du wp14">
   <w:p>
     <w:pPr>
       <w:spacing w:after="120"/>
@@ -6407,7 +6322,7 @@
 </file>
 
 <file path=word/footnotes.xml><?xml version="1.0" encoding="utf-8"?>
-<w:footnotes xmlns:wpc="http://schemas.microsoft.com/office/word/2010/wordprocessingCanvas" xmlns:cx="http://schemas.microsoft.com/office/drawing/2014/chartex" xmlns:cx1="http://schemas.microsoft.com/office/drawing/2015/9/8/chartex" xmlns:mc="http://schemas.openxmlformats.org/markup-compatibility/2006" xmlns:o="urn:schemas-microsoft-com:office:office" xmlns:r="http://schemas.openxmlformats.org/officeDocument/2006/relationships" xmlns:m="http://schemas.openxmlformats.org/officeDocument/2006/math" xmlns:v="urn:schemas-microsoft-com:vml" xmlns:wp14="http://schemas.microsoft.com/office/word/2010/wordprocessingDrawing" xmlns:wp="http://schemas.openxmlformats.org/drawingml/2006/wordprocessingDrawing" xmlns:w10="urn:schemas-microsoft-com:office:word" xmlns:w="http://schemas.openxmlformats.org/wordprocessingml/2006/main" xmlns:w14="http://schemas.microsoft.com/office/word/2010/wordml" xmlns:w15="http://schemas.microsoft.com/office/word/2012/wordml" xmlns:w16se="http://schemas.microsoft.com/office/word/2015/wordml/symex" xmlns:wpg="http://schemas.microsoft.com/office/word/2010/wordprocessingGroup" xmlns:wpi="http://schemas.microsoft.com/office/word/2010/wordprocessingInk" xmlns:wne="http://schemas.microsoft.com/office/word/2006/wordml" xmlns:wps="http://schemas.microsoft.com/office/word/2010/wordprocessingShape" mc:Ignorable="w14 w15 w16se wp14">
+<w:footnotes xmlns:wpc="http://schemas.microsoft.com/office/word/2010/wordprocessingCanvas" xmlns:cx="http://schemas.microsoft.com/office/drawing/2014/chartex" xmlns:cx1="http://schemas.microsoft.com/office/drawing/2015/9/8/chartex" xmlns:cx2="http://schemas.microsoft.com/office/drawing/2015/10/21/chartex" xmlns:cx3="http://schemas.microsoft.com/office/drawing/2016/5/9/chartex" xmlns:cx4="http://schemas.microsoft.com/office/drawing/2016/5/10/chartex" xmlns:cx5="http://schemas.microsoft.com/office/drawing/2016/5/11/chartex" xmlns:cx6="http://schemas.microsoft.com/office/drawing/2016/5/12/chartex" xmlns:cx7="http://schemas.microsoft.com/office/drawing/2016/5/13/chartex" xmlns:cx8="http://schemas.microsoft.com/office/drawing/2016/5/14/chartex" xmlns:mc="http://schemas.openxmlformats.org/markup-compatibility/2006" xmlns:aink="http://schemas.microsoft.com/office/drawing/2016/ink" xmlns:am3d="http://schemas.microsoft.com/office/drawing/2017/model3d" xmlns:o="urn:schemas-microsoft-com:office:office" xmlns:oel="http://schemas.microsoft.com/office/2019/extlst" xmlns:r="http://schemas.openxmlformats.org/officeDocument/2006/relationships" xmlns:m="http://schemas.openxmlformats.org/officeDocument/2006/math" xmlns:v="urn:schemas-microsoft-com:vml" xmlns:wp14="http://schemas.microsoft.com/office/word/2010/wordprocessingDrawing" xmlns:wp="http://schemas.openxmlformats.org/drawingml/2006/wordprocessingDrawing" xmlns:w10="urn:schemas-microsoft-com:office:word" xmlns:w="http://schemas.openxmlformats.org/wordprocessingml/2006/main" xmlns:w14="http://schemas.microsoft.com/office/word/2010/wordml" xmlns:w15="http://schemas.microsoft.com/office/word/2012/wordml" xmlns:w16cex="http://schemas.microsoft.com/office/word/2018/wordml/cex" xmlns:w16cid="http://schemas.microsoft.com/office/word/2016/wordml/cid" xmlns:w16="http://schemas.microsoft.com/office/word/2018/wordml" xmlns:w16du="http://schemas.microsoft.com/office/word/2023/wordml/word16du" xmlns:w16sdtdh="http://schemas.microsoft.com/office/word/2020/wordml/sdtdatahash" xmlns:w16sdtfl="http://schemas.microsoft.com/office/word/2024/wordml/sdtformatlock" xmlns:w16se="http://schemas.microsoft.com/office/word/2015/wordml/symex" xmlns:wpg="http://schemas.microsoft.com/office/word/2010/wordprocessingGroup" xmlns:wpi="http://schemas.microsoft.com/office/word/2010/wordprocessingInk" xmlns:wne="http://schemas.microsoft.com/office/word/2006/wordml" xmlns:wps="http://schemas.microsoft.com/office/word/2010/wordprocessingShape" mc:Ignorable="w14 w15 w16se w16cid w16 w16cex w16sdtdh w16sdtfl w16du wp14">
   <w:footnote w:type="separator" w:id="-1">
     <w:p>
       <w:r>
@@ -6426,7 +6341,7 @@
 </file>
 
 <file path=word/numbering.xml><?xml version="1.0" encoding="utf-8"?>
-<w:numbering xmlns:wpc="http://schemas.microsoft.com/office/word/2010/wordprocessingCanvas" xmlns:cx="http://schemas.microsoft.com/office/drawing/2014/chartex" xmlns:cx1="http://schemas.microsoft.com/office/drawing/2015/9/8/chartex" xmlns:mc="http://schemas.openxmlformats.org/markup-compatibility/2006" xmlns:o="urn:schemas-microsoft-com:office:office" xmlns:r="http://schemas.openxmlformats.org/officeDocument/2006/relationships" xmlns:m="http://schemas.openxmlformats.org/officeDocument/2006/math" xmlns:v="urn:schemas-microsoft-com:vml" xmlns:wp14="http://schemas.microsoft.com/office/word/2010/wordprocessingDrawing" xmlns:wp="http://schemas.openxmlformats.org/drawingml/2006/wordprocessingDrawing" xmlns:w10="urn:schemas-microsoft-com:office:word" xmlns:w="http://schemas.openxmlformats.org/wordprocessingml/2006/main" xmlns:w14="http://schemas.microsoft.com/office/word/2010/wordml" xmlns:w15="http://schemas.microsoft.com/office/word/2012/wordml" xmlns:w16se="http://schemas.microsoft.com/office/word/2015/wordml/symex" xmlns:wpg="http://schemas.microsoft.com/office/word/2010/wordprocessingGroup" xmlns:wpi="http://schemas.microsoft.com/office/word/2010/wordprocessingInk" xmlns:wne="http://schemas.microsoft.com/office/word/2006/wordml" xmlns:wps="http://schemas.microsoft.com/office/word/2010/wordprocessingShape" mc:Ignorable="w14 w15 w16se wp14">
+<w:numbering xmlns:wpc="http://schemas.microsoft.com/office/word/2010/wordprocessingCanvas" xmlns:cx="http://schemas.microsoft.com/office/drawing/2014/chartex" xmlns:cx1="http://schemas.microsoft.com/office/drawing/2015/9/8/chartex" xmlns:cx2="http://schemas.microsoft.com/office/drawing/2015/10/21/chartex" xmlns:cx3="http://schemas.microsoft.com/office/drawing/2016/5/9/chartex" xmlns:cx4="http://schemas.microsoft.com/office/drawing/2016/5/10/chartex" xmlns:cx5="http://schemas.microsoft.com/office/drawing/2016/5/11/chartex" xmlns:cx6="http://schemas.microsoft.com/office/drawing/2016/5/12/chartex" xmlns:cx7="http://schemas.microsoft.com/office/drawing/2016/5/13/chartex" xmlns:cx8="http://schemas.microsoft.com/office/drawing/2016/5/14/chartex" xmlns:mc="http://schemas.openxmlformats.org/markup-compatibility/2006" xmlns:aink="http://schemas.microsoft.com/office/drawing/2016/ink" xmlns:am3d="http://schemas.microsoft.com/office/drawing/2017/model3d" xmlns:o="urn:schemas-microsoft-com:office:office" xmlns:oel="http://schemas.microsoft.com/office/2019/extlst" xmlns:r="http://schemas.openxmlformats.org/officeDocument/2006/relationships" xmlns:m="http://schemas.openxmlformats.org/officeDocument/2006/math" xmlns:v="urn:schemas-microsoft-com:vml" xmlns:wp14="http://schemas.microsoft.com/office/word/2010/wordprocessingDrawing" xmlns:wp="http://schemas.openxmlformats.org/drawingml/2006/wordprocessingDrawing" xmlns:w10="urn:schemas-microsoft-com:office:word" xmlns:w="http://schemas.openxmlformats.org/wordprocessingml/2006/main" xmlns:w14="http://schemas.microsoft.com/office/word/2010/wordml" xmlns:w15="http://schemas.microsoft.com/office/word/2012/wordml" xmlns:w16cex="http://schemas.microsoft.com/office/word/2018/wordml/cex" xmlns:w16cid="http://schemas.microsoft.com/office/word/2016/wordml/cid" xmlns:w16="http://schemas.microsoft.com/office/word/2018/wordml" xmlns:w16du="http://schemas.microsoft.com/office/word/2023/wordml/word16du" xmlns:w16sdtdh="http://schemas.microsoft.com/office/word/2020/wordml/sdtdatahash" xmlns:w16sdtfl="http://schemas.microsoft.com/office/word/2024/wordml/sdtformatlock" xmlns:w16se="http://schemas.microsoft.com/office/word/2015/wordml/symex" xmlns:wpg="http://schemas.microsoft.com/office/word/2010/wordprocessingGroup" xmlns:wpi="http://schemas.microsoft.com/office/word/2010/wordprocessingInk" xmlns:wne="http://schemas.microsoft.com/office/word/2006/wordml" xmlns:wps="http://schemas.microsoft.com/office/word/2010/wordprocessingShape" mc:Ignorable="w14 w15 w16se w16cid w16 w16cex w16sdtdh w16sdtfl w16du wp14">
   <w:abstractNum w:abstractNumId="0" w15:restartNumberingAfterBreak="0">
     <w:nsid w:val="14AD5C69"/>
     <w:multiLevelType w:val="multilevel"/>
@@ -6914,23 +6829,23 @@
       </w:rPr>
     </w:lvl>
   </w:abstractNum>
-  <w:num w:numId="1">
+  <w:num w:numId="1" w16cid:durableId="549272904">
     <w:abstractNumId w:val="3"/>
   </w:num>
-  <w:num w:numId="2">
+  <w:num w:numId="2" w16cid:durableId="622617600">
     <w:abstractNumId w:val="0"/>
   </w:num>
-  <w:num w:numId="3">
+  <w:num w:numId="3" w16cid:durableId="696858518">
     <w:abstractNumId w:val="2"/>
   </w:num>
-  <w:num w:numId="4">
+  <w:num w:numId="4" w16cid:durableId="560754709">
     <w:abstractNumId w:val="1"/>
   </w:num>
 </w:numbering>
 </file>
 
 <file path=word/styles.xml><?xml version="1.0" encoding="utf-8"?>
-<w:styles xmlns:mc="http://schemas.openxmlformats.org/markup-compatibility/2006" xmlns:r="http://schemas.openxmlformats.org/officeDocument/2006/relationships" xmlns:w="http://schemas.openxmlformats.org/wordprocessingml/2006/main" xmlns:w14="http://schemas.microsoft.com/office/word/2010/wordml" xmlns:w15="http://schemas.microsoft.com/office/word/2012/wordml" xmlns:w16se="http://schemas.microsoft.com/office/word/2015/wordml/symex" mc:Ignorable="w14 w15 w16se">
+<w:styles xmlns:mc="http://schemas.openxmlformats.org/markup-compatibility/2006" xmlns:r="http://schemas.openxmlformats.org/officeDocument/2006/relationships" xmlns:w="http://schemas.openxmlformats.org/wordprocessingml/2006/main" xmlns:w14="http://schemas.microsoft.com/office/word/2010/wordml" xmlns:w15="http://schemas.microsoft.com/office/word/2012/wordml" xmlns:w16cex="http://schemas.microsoft.com/office/word/2018/wordml/cex" xmlns:w16cid="http://schemas.microsoft.com/office/word/2016/wordml/cid" xmlns:w16="http://schemas.microsoft.com/office/word/2018/wordml" xmlns:w16du="http://schemas.microsoft.com/office/word/2023/wordml/word16du" xmlns:w16sdtdh="http://schemas.microsoft.com/office/word/2020/wordml/sdtdatahash" xmlns:w16sdtfl="http://schemas.microsoft.com/office/word/2024/wordml/sdtformatlock" xmlns:w16se="http://schemas.microsoft.com/office/word/2015/wordml/symex" mc:Ignorable="w14 w15 w16se w16cid w16 w16cex w16sdtdh w16sdtfl w16du">
   <w:docDefaults>
     <w:rPrDefault>
       <w:rPr>
@@ -6940,7 +6855,7 @@
     </w:rPrDefault>
     <w:pPrDefault/>
   </w:docDefaults>
-  <w:latentStyles w:defLockedState="0" w:defUIPriority="99" w:defSemiHidden="0" w:defUnhideWhenUsed="0" w:defQFormat="0" w:count="371">
+  <w:latentStyles w:defLockedState="0" w:defUIPriority="99" w:defSemiHidden="0" w:defUnhideWhenUsed="0" w:defQFormat="0" w:count="376">
     <w:lsdException w:name="Normal" w:uiPriority="0" w:qFormat="1"/>
     <w:lsdException w:name="heading 1" w:qFormat="1"/>
     <w:lsdException w:name="heading 2" w:semiHidden="1" w:uiPriority="9" w:unhideWhenUsed="1" w:qFormat="1"/>
@@ -7312,8 +7227,13 @@
     <w:lsdException w:name="List Table 5 Dark Accent 6" w:uiPriority="50"/>
     <w:lsdException w:name="List Table 6 Colorful Accent 6" w:uiPriority="51"/>
     <w:lsdException w:name="List Table 7 Colorful Accent 6" w:uiPriority="52"/>
+    <w:lsdException w:name="Mention" w:semiHidden="1" w:unhideWhenUsed="1"/>
+    <w:lsdException w:name="Smart Hyperlink" w:semiHidden="1" w:unhideWhenUsed="1"/>
+    <w:lsdException w:name="Hashtag" w:semiHidden="1" w:unhideWhenUsed="1"/>
+    <w:lsdException w:name="Unresolved Mention" w:semiHidden="1" w:unhideWhenUsed="1"/>
+    <w:lsdException w:name="Smart Link" w:semiHidden="1" w:unhideWhenUsed="1"/>
   </w:latentStyles>
-  <w:style w:type="paragraph" w:default="1" w:styleId="Normln">
+  <w:style w:type="paragraph" w:default="1" w:styleId="Normal">
     <w:name w:val="Normal"/>
     <w:rsid w:val="0026777B"/>
     <w:pPr>
@@ -7323,11 +7243,11 @@
       <w:color w:val="333333"/>
     </w:rPr>
   </w:style>
-  <w:style w:type="paragraph" w:styleId="Nadpis1">
+  <w:style w:type="paragraph" w:styleId="Heading1">
     <w:name w:val="heading 1"/>
-    <w:basedOn w:val="Normln"/>
-    <w:next w:val="Normln"/>
-    <w:link w:val="Nadpis1Char"/>
+    <w:basedOn w:val="Normal"/>
+    <w:next w:val="Normal"/>
+    <w:link w:val="Heading1Char"/>
     <w:uiPriority w:val="99"/>
     <w:qFormat/>
     <w:rsid w:val="0026777B"/>
@@ -7345,10 +7265,10 @@
       <w:lang w:val="en-GB" w:eastAsia="cs-CZ"/>
     </w:rPr>
   </w:style>
-  <w:style w:type="paragraph" w:styleId="Nadpis2">
+  <w:style w:type="paragraph" w:styleId="Heading2">
     <w:name w:val="heading 2"/>
-    <w:basedOn w:val="Normln"/>
-    <w:next w:val="Normln"/>
+    <w:basedOn w:val="Normal"/>
+    <w:next w:val="Normal"/>
     <w:rsid w:val="0026777B"/>
     <w:pPr>
       <w:keepNext/>
@@ -7362,10 +7282,10 @@
       <w:lang w:val="en-GB"/>
     </w:rPr>
   </w:style>
-  <w:style w:type="paragraph" w:styleId="Nadpis3">
+  <w:style w:type="paragraph" w:styleId="Heading3">
     <w:name w:val="heading 3"/>
-    <w:basedOn w:val="Normln"/>
-    <w:next w:val="Normln"/>
+    <w:basedOn w:val="Normal"/>
+    <w:next w:val="Normal"/>
     <w:pPr>
       <w:keepNext/>
       <w:keepLines/>
@@ -7376,10 +7296,10 @@
       <w:b/>
     </w:rPr>
   </w:style>
-  <w:style w:type="paragraph" w:styleId="Nadpis4">
+  <w:style w:type="paragraph" w:styleId="Heading4">
     <w:name w:val="heading 4"/>
-    <w:basedOn w:val="Normln"/>
-    <w:next w:val="Normln"/>
+    <w:basedOn w:val="Normal"/>
+    <w:next w:val="Normal"/>
     <w:pPr>
       <w:keepNext/>
       <w:keepLines/>
@@ -7390,10 +7310,10 @@
       <w:b/>
     </w:rPr>
   </w:style>
-  <w:style w:type="paragraph" w:styleId="Nadpis5">
+  <w:style w:type="paragraph" w:styleId="Heading5">
     <w:name w:val="heading 5"/>
-    <w:basedOn w:val="Normln"/>
-    <w:next w:val="Normln"/>
+    <w:basedOn w:val="Normal"/>
+    <w:next w:val="Normal"/>
     <w:pPr>
       <w:keepNext/>
       <w:keepLines/>
@@ -7404,10 +7324,10 @@
       <w:b/>
     </w:rPr>
   </w:style>
-  <w:style w:type="paragraph" w:styleId="Nadpis6">
+  <w:style w:type="paragraph" w:styleId="Heading6">
     <w:name w:val="heading 6"/>
-    <w:basedOn w:val="Normln"/>
-    <w:next w:val="Normln"/>
+    <w:basedOn w:val="Normal"/>
+    <w:next w:val="Normal"/>
     <w:pPr>
       <w:keepNext/>
       <w:keepLines/>
@@ -7418,13 +7338,13 @@
       <w:b/>
     </w:rPr>
   </w:style>
-  <w:style w:type="character" w:default="1" w:styleId="Standardnpsmoodstavce">
+  <w:style w:type="character" w:default="1" w:styleId="DefaultParagraphFont">
     <w:name w:val="Default Paragraph Font"/>
     <w:uiPriority w:val="1"/>
     <w:semiHidden/>
     <w:unhideWhenUsed/>
   </w:style>
-  <w:style w:type="table" w:default="1" w:styleId="Normlntabulka">
+  <w:style w:type="table" w:default="1" w:styleId="TableNormal">
     <w:name w:val="Normal Table"/>
     <w:uiPriority w:val="99"/>
     <w:semiHidden/>
@@ -7439,13 +7359,13 @@
       </w:tblCellMar>
     </w:tblPr>
   </w:style>
-  <w:style w:type="numbering" w:default="1" w:styleId="Bezseznamu">
+  <w:style w:type="numbering" w:default="1" w:styleId="NoList">
     <w:name w:val="No List"/>
     <w:uiPriority w:val="99"/>
     <w:semiHidden/>
     <w:unhideWhenUsed/>
   </w:style>
-  <w:style w:type="table" w:customStyle="1" w:styleId="TableNormal">
+  <w:style w:type="table" w:customStyle="1" w:styleId="TableNormal0">
     <w:name w:val="TableNormal"/>
     <w:tblPr>
       <w:tblCellMar>
@@ -7456,11 +7376,11 @@
       </w:tblCellMar>
     </w:tblPr>
   </w:style>
-  <w:style w:type="paragraph" w:styleId="Nzev">
+  <w:style w:type="paragraph" w:styleId="Title">
     <w:name w:val="Title"/>
-    <w:basedOn w:val="Normln"/>
-    <w:next w:val="Normln"/>
-    <w:link w:val="NzevChar"/>
+    <w:basedOn w:val="Normal"/>
+    <w:next w:val="Normal"/>
+    <w:link w:val="TitleChar"/>
     <w:qFormat/>
     <w:pPr>
       <w:keepNext/>
@@ -7530,23 +7450,23 @@
       </w:tblCellMar>
     </w:tblPr>
   </w:style>
-  <w:style w:type="paragraph" w:styleId="Textkomente">
+  <w:style w:type="paragraph" w:styleId="CommentText">
     <w:name w:val="annotation text"/>
-    <w:link w:val="TextkomenteChar"/>
+    <w:link w:val="CommentTextChar"/>
     <w:uiPriority w:val="99"/>
     <w:unhideWhenUsed/>
     <w:rsid w:val="003D0A66"/>
   </w:style>
-  <w:style w:type="character" w:customStyle="1" w:styleId="TextkomenteChar">
-    <w:name w:val="Text komentáře Char"/>
-    <w:basedOn w:val="Standardnpsmoodstavce"/>
-    <w:link w:val="Textkomente"/>
+  <w:style w:type="character" w:customStyle="1" w:styleId="CommentTextChar">
+    <w:name w:val="Comment Text Char"/>
+    <w:basedOn w:val="DefaultParagraphFont"/>
+    <w:link w:val="CommentText"/>
     <w:uiPriority w:val="99"/>
     <w:rsid w:val="003D0A66"/>
   </w:style>
-  <w:style w:type="character" w:styleId="Odkaznakoment">
+  <w:style w:type="character" w:styleId="CommentReference">
     <w:name w:val="annotation reference"/>
-    <w:basedOn w:val="Standardnpsmoodstavce"/>
+    <w:basedOn w:val="DefaultParagraphFont"/>
     <w:uiPriority w:val="99"/>
     <w:semiHidden/>
     <w:unhideWhenUsed/>
@@ -7556,9 +7476,9 @@
       <w:szCs w:val="16"/>
     </w:rPr>
   </w:style>
-  <w:style w:type="paragraph" w:styleId="Textbubliny">
+  <w:style w:type="paragraph" w:styleId="BalloonText">
     <w:name w:val="Balloon Text"/>
-    <w:link w:val="TextbublinyChar"/>
+    <w:link w:val="BalloonTextChar"/>
     <w:uiPriority w:val="99"/>
     <w:semiHidden/>
     <w:unhideWhenUsed/>
@@ -7569,10 +7489,10 @@
       <w:szCs w:val="18"/>
     </w:rPr>
   </w:style>
-  <w:style w:type="character" w:customStyle="1" w:styleId="TextbublinyChar">
-    <w:name w:val="Text bubliny Char"/>
-    <w:basedOn w:val="Standardnpsmoodstavce"/>
-    <w:link w:val="Textbubliny"/>
+  <w:style w:type="character" w:customStyle="1" w:styleId="BalloonTextChar">
+    <w:name w:val="Balloon Text Char"/>
+    <w:basedOn w:val="DefaultParagraphFont"/>
+    <w:link w:val="BalloonText"/>
     <w:uiPriority w:val="99"/>
     <w:semiHidden/>
     <w:rsid w:val="004E7B56"/>
@@ -7582,9 +7502,9 @@
       <w:szCs w:val="18"/>
     </w:rPr>
   </w:style>
-  <w:style w:type="character" w:styleId="Siln">
+  <w:style w:type="character" w:styleId="Strong">
     <w:name w:val="Strong"/>
-    <w:basedOn w:val="Standardnpsmoodstavce"/>
+    <w:basedOn w:val="DefaultParagraphFont"/>
     <w:uiPriority w:val="22"/>
     <w:qFormat/>
     <w:rsid w:val="004D249A"/>
@@ -7607,14 +7527,14 @@
   </w:style>
   <w:style w:type="character" w:customStyle="1" w:styleId="TextnormyChar1">
     <w:name w:val="Text normy Char1"/>
-    <w:basedOn w:val="Standardnpsmoodstavce"/>
+    <w:basedOn w:val="DefaultParagraphFont"/>
     <w:link w:val="Textnormy"/>
     <w:rsid w:val="00FE47D7"/>
     <w:rPr>
       <w:rFonts w:eastAsia="Times New Roman" w:cs="Times New Roman"/>
     </w:rPr>
   </w:style>
-  <w:style w:type="paragraph" w:styleId="Titulek">
+  <w:style w:type="paragraph" w:styleId="Caption">
     <w:name w:val="caption"/>
     <w:uiPriority w:val="35"/>
     <w:unhideWhenUsed/>
@@ -7638,7 +7558,7 @@
       <w:szCs w:val="18"/>
     </w:rPr>
   </w:style>
-  <w:style w:type="paragraph" w:styleId="Odstavecseseznamem">
+  <w:style w:type="paragraph" w:styleId="ListParagraph">
     <w:name w:val="List Paragraph"/>
     <w:uiPriority w:val="34"/>
     <w:qFormat/>
@@ -7648,9 +7568,9 @@
       <w:contextualSpacing/>
     </w:pPr>
   </w:style>
-  <w:style w:type="table" w:styleId="Mkatabulky">
+  <w:style w:type="table" w:styleId="TableGrid">
     <w:name w:val="Table Grid"/>
-    <w:basedOn w:val="Normlntabulka"/>
+    <w:basedOn w:val="TableNormal"/>
     <w:uiPriority w:val="39"/>
     <w:rsid w:val="001F18C5"/>
     <w:tblPr>
@@ -7664,11 +7584,11 @@
       </w:tblBorders>
     </w:tblPr>
   </w:style>
-  <w:style w:type="paragraph" w:styleId="Pedmtkomente">
+  <w:style w:type="paragraph" w:styleId="CommentSubject">
     <w:name w:val="annotation subject"/>
-    <w:basedOn w:val="Textkomente"/>
-    <w:next w:val="Textkomente"/>
-    <w:link w:val="PedmtkomenteChar"/>
+    <w:basedOn w:val="CommentText"/>
+    <w:next w:val="CommentText"/>
+    <w:link w:val="CommentSubjectChar"/>
     <w:uiPriority w:val="99"/>
     <w:semiHidden/>
     <w:unhideWhenUsed/>
@@ -7678,10 +7598,10 @@
       <w:bCs/>
     </w:rPr>
   </w:style>
-  <w:style w:type="character" w:customStyle="1" w:styleId="PedmtkomenteChar">
-    <w:name w:val="Předmět komentáře Char"/>
-    <w:basedOn w:val="TextkomenteChar"/>
-    <w:link w:val="Pedmtkomente"/>
+  <w:style w:type="character" w:customStyle="1" w:styleId="CommentSubjectChar">
+    <w:name w:val="Comment Subject Char"/>
+    <w:basedOn w:val="CommentTextChar"/>
+    <w:link w:val="CommentSubject"/>
     <w:uiPriority w:val="99"/>
     <w:semiHidden/>
     <w:rsid w:val="002009E2"/>
@@ -7770,10 +7690,10 @@
       </w:tblCellMar>
     </w:tblPr>
   </w:style>
-  <w:style w:type="paragraph" w:styleId="Podnadpis">
+  <w:style w:type="paragraph" w:styleId="Subtitle">
     <w:name w:val="Subtitle"/>
-    <w:basedOn w:val="Normln"/>
-    <w:next w:val="Normln"/>
+    <w:basedOn w:val="Normal"/>
+    <w:next w:val="Normal"/>
     <w:pPr>
       <w:keepNext/>
       <w:keepLines/>
@@ -7809,16 +7729,16 @@
       </w:tblCellMar>
     </w:tblPr>
   </w:style>
-  <w:style w:type="paragraph" w:styleId="Revize">
+  <w:style w:type="paragraph" w:styleId="Revision">
     <w:name w:val="Revision"/>
     <w:hidden/>
     <w:uiPriority w:val="99"/>
     <w:semiHidden/>
     <w:rsid w:val="00434AF9"/>
   </w:style>
-  <w:style w:type="character" w:styleId="Hypertextovodkaz">
+  <w:style w:type="character" w:styleId="Hyperlink">
     <w:name w:val="Hyperlink"/>
-    <w:basedOn w:val="Standardnpsmoodstavce"/>
+    <w:basedOn w:val="DefaultParagraphFont"/>
     <w:uiPriority w:val="99"/>
     <w:unhideWhenUsed/>
     <w:rsid w:val="00051089"/>
@@ -7827,9 +7747,9 @@
       <w:u w:val="single"/>
     </w:rPr>
   </w:style>
-  <w:style w:type="character" w:customStyle="1" w:styleId="NzevChar">
-    <w:name w:val="Název Char"/>
-    <w:link w:val="Nzev"/>
+  <w:style w:type="character" w:customStyle="1" w:styleId="TitleChar">
+    <w:name w:val="Title Char"/>
+    <w:link w:val="Title"/>
     <w:rsid w:val="00E01E87"/>
     <w:rPr>
       <w:b/>
@@ -7846,9 +7766,9 @@
       <w:u w:val="single"/>
     </w:rPr>
   </w:style>
-  <w:style w:type="character" w:customStyle="1" w:styleId="Nadpis1Char">
-    <w:name w:val="Nadpis 1 Char"/>
-    <w:link w:val="Nadpis1"/>
+  <w:style w:type="character" w:customStyle="1" w:styleId="Heading1Char">
+    <w:name w:val="Heading 1 Char"/>
+    <w:link w:val="Heading1"/>
     <w:uiPriority w:val="99"/>
     <w:rsid w:val="0026777B"/>
     <w:rPr>

</xml_diff>

<commit_message>
input: fixed abbreviations everywhere
</commit_message>
<xml_diff>
--- a/input/CEN_TS_16157-13.docx
+++ b/input/CEN_TS_16157-13.docx
@@ -980,15 +980,14 @@
       </w:r>
       <w:r>
         <w:rPr>
-          <w:lang w:val="en-GB"/>
-        </w:rPr>
-        <w:tab/>
-      </w:r>
-      <w:r>
-        <w:rPr>
-          <w:lang w:val="en-GB"/>
-        </w:rPr>
-        <w:tab/>
+          <w:lang w:val="en-US"/>
+        </w:rPr>
+        <w:t xml:space="preserve"> – </w:t>
+      </w:r>
+      <w:r>
+        <w:rPr>
+          <w:lang w:val="en-GB"/>
+        </w:rPr>
         <w:t xml:space="preserve">Unified </w:t>
       </w:r>
       <w:proofErr w:type="spellStart"/>
@@ -1023,15 +1022,9 @@
       </w:r>
       <w:r>
         <w:rPr>
-          <w:lang w:val="en-GB"/>
-        </w:rPr>
-        <w:tab/>
-      </w:r>
-      <w:r>
-        <w:rPr>
-          <w:lang w:val="en-GB"/>
-        </w:rPr>
-        <w:tab/>
+          <w:lang w:val="en-US"/>
+        </w:rPr>
+        <w:t xml:space="preserve"> – </w:t>
       </w:r>
       <w:proofErr w:type="spellStart"/>
       <w:r>
@@ -1065,15 +1058,14 @@
       </w:r>
       <w:r>
         <w:rPr>
-          <w:lang w:val="en-GB"/>
-        </w:rPr>
-        <w:tab/>
-      </w:r>
-      <w:r>
-        <w:rPr>
-          <w:lang w:val="en-GB"/>
-        </w:rPr>
-        <w:tab/>
+          <w:lang w:val="en-US"/>
+        </w:rPr>
+        <w:t xml:space="preserve"> – </w:t>
+      </w:r>
+      <w:r>
+        <w:rPr>
+          <w:lang w:val="en-GB"/>
+        </w:rPr>
         <w:t>Object Identifier</w:t>
       </w:r>
     </w:p>

</xml_diff>